<commit_message>
Update JobVault project description in CV template
Rebrands JobVault as an AI-driven job application platform, describing
the Claude-powered agent that selects experience and generates tailored
CVs/cover letters, the RabbitMQ pipeline that commits documents via the
Git Trees API, and the CI/CD deployment with k6 load test results.
</commit_message>
<xml_diff>
--- a/templates/cv_template.docx
+++ b/templates/cv_template.docx
@@ -54,7 +54,7 @@
         <w:spacing w:after="0" w:before="0"/>
         <w:jc w:val="center"/>
       </w:pPr>
-      <w:hyperlink w:history="1" r:id="rIdvyyv-ibrtcr50zuu-ulzw">
+      <w:hyperlink w:history="1" r:id="rId0n-hny-ng-rtcjdwinffh">
         <w:r>
           <w:rPr>
             <w:rFonts w:ascii="Calibri" w:cs="Calibri" w:eastAsia="Calibri" w:hAnsi="Calibri"/>
@@ -75,7 +75,7 @@
         </w:rPr>
         <w:t xml:space="preserve">  |  </w:t>
       </w:r>
-      <w:hyperlink w:history="1" r:id="rIdgy7ldbcewoclyudpktp-f">
+      <w:hyperlink w:history="1" r:id="rId2mecg1omohuw3zbn0hi_y">
         <w:r>
           <w:rPr>
             <w:rFonts w:ascii="Calibri" w:cs="Calibri" w:eastAsia="Calibri" w:hAnsi="Calibri"/>
@@ -938,7 +938,7 @@
         <w:keepNext/>
         <w:spacing w:after="20" w:before="100"/>
       </w:pPr>
-      <w:hyperlink w:history="1" r:id="rIdnbrpq812q2fxjr4bfs0r3">
+      <w:hyperlink w:history="1" r:id="rIdcy8-ijlwl489ylj1pljsd">
         <w:r>
           <w:rPr>
             <w:rFonts w:ascii="Calibri" w:cs="Calibri" w:eastAsia="Calibri" w:hAnsi="Calibri"/>
@@ -977,7 +977,7 @@
         <w:keepNext/>
         <w:spacing w:after="20" w:before="100"/>
       </w:pPr>
-      <w:hyperlink w:history="1" r:id="rIdy5dtilwkoyax9qi80tfku">
+      <w:hyperlink w:history="1" r:id="rIdf9ueh7-ckk98zd9dhpiwm">
         <w:r>
           <w:rPr>
             <w:rFonts w:ascii="Calibri" w:cs="Calibri" w:eastAsia="Calibri" w:hAnsi="Calibri"/>
@@ -1016,7 +1016,7 @@
         <w:keepNext/>
         <w:spacing w:after="20" w:before="100"/>
       </w:pPr>
-      <w:hyperlink w:history="1" r:id="rIdwfpdtcgucojp0ntbhtfbl">
+      <w:hyperlink w:history="1" r:id="rIdx4ffxipc8rdobbmwgp3zy">
         <w:r>
           <w:rPr>
             <w:rFonts w:ascii="Calibri" w:cs="Calibri" w:eastAsia="Calibri" w:hAnsi="Calibri"/>
@@ -1065,7 +1065,7 @@
           <w:szCs w:val="20"/>
           <w:u w:val="single"/>
         </w:rPr>
-        <w:t xml:space="preserve">JobVault – Job Application Tracking Platform</w:t>
+        <w:t xml:space="preserve">JobVault – AI-Driven Job Application Platform</w:t>
       </w:r>
     </w:p>
     <w:p>
@@ -1084,7 +1084,7 @@
           <w:sz w:val="20"/>
           <w:szCs w:val="20"/>
         </w:rPr>
-        <w:t xml:space="preserve">Architected and built a self-hosted job-application management platform using .NET 9, Vue 3, MongoDB, and RabbitMQ, deployed via Cloudflare Tunnel</w:t>
+        <w:t xml:space="preserve">Architected a self-hosted platform (.NET 9, Vue 3, MongoDB) where a Claude-powered agent evaluates job postings and selects real experience from a curated bullet library to generate tailored CVs and cover letters, removing manual tailoring and constraining generation against hallucinated experience</w:t>
       </w:r>
     </w:p>
     <w:p>
@@ -1103,7 +1103,26 @@
           <w:sz w:val="20"/>
           <w:szCs w:val="20"/>
         </w:rPr>
-        <w:t xml:space="preserve">Designed an event-driven backend using RabbitMQ and GitHub webhook ingestion to automatically capture, store, and version application documents committed to a private repository</w:t>
+        <w:t xml:space="preserve">Built an event-driven pipeline (RabbitMQ, Worker service) that generates DOCX/PDF documents and commits them atomically to a GitHub-based document vault via the Git Trees API, with dead-letter retry handling</w:t>
+      </w:r>
+    </w:p>
+    <w:p>
+      <w:pPr>
+        <w:pStyle w:val="ListParagraph"/>
+        <w:numPr>
+          <w:ilvl w:val="0"/>
+          <w:numId w:val="2"/>
+        </w:numPr>
+        <w:spacing w:after="20" w:before="20"/>
+      </w:pPr>
+      <w:r>
+        <w:rPr>
+          <w:rFonts w:ascii="Calibri" w:cs="Calibri" w:eastAsia="Calibri" w:hAnsi="Calibri"/>
+          <w:color w:val="333333"/>
+          <w:sz w:val="20"/>
+          <w:szCs w:val="20"/>
+        </w:rPr>
+        <w:t xml:space="preserve">Deployed via a full GitHub Actions CI/CD pipeline and Cloudflare Tunnel, achieving 11ms average API response time at 0% error rate under load testing (k6)</w:t>
       </w:r>
     </w:p>
     <w:p>

</xml_diff>

<commit_message>
Update JobVault project description in CV template (#5)
Rebrands JobVault as an AI-driven job application platform, describing
the Claude-powered agent that selects experience and generates tailored
CVs/cover letters, the RabbitMQ pipeline that commits documents via the
Git Trees API, and the CI/CD deployment with k6 load test results.

Co-authored-by: Claude <noreply@anthropic.com>
</commit_message>
<xml_diff>
--- a/templates/cv_template.docx
+++ b/templates/cv_template.docx
@@ -54,7 +54,7 @@
         <w:spacing w:after="0" w:before="0"/>
         <w:jc w:val="center"/>
       </w:pPr>
-      <w:hyperlink w:history="1" r:id="rIdvyyv-ibrtcr50zuu-ulzw">
+      <w:hyperlink w:history="1" r:id="rId0n-hny-ng-rtcjdwinffh">
         <w:r>
           <w:rPr>
             <w:rFonts w:ascii="Calibri" w:cs="Calibri" w:eastAsia="Calibri" w:hAnsi="Calibri"/>
@@ -75,7 +75,7 @@
         </w:rPr>
         <w:t xml:space="preserve">  |  </w:t>
       </w:r>
-      <w:hyperlink w:history="1" r:id="rIdgy7ldbcewoclyudpktp-f">
+      <w:hyperlink w:history="1" r:id="rId2mecg1omohuw3zbn0hi_y">
         <w:r>
           <w:rPr>
             <w:rFonts w:ascii="Calibri" w:cs="Calibri" w:eastAsia="Calibri" w:hAnsi="Calibri"/>
@@ -938,7 +938,7 @@
         <w:keepNext/>
         <w:spacing w:after="20" w:before="100"/>
       </w:pPr>
-      <w:hyperlink w:history="1" r:id="rIdnbrpq812q2fxjr4bfs0r3">
+      <w:hyperlink w:history="1" r:id="rIdcy8-ijlwl489ylj1pljsd">
         <w:r>
           <w:rPr>
             <w:rFonts w:ascii="Calibri" w:cs="Calibri" w:eastAsia="Calibri" w:hAnsi="Calibri"/>
@@ -977,7 +977,7 @@
         <w:keepNext/>
         <w:spacing w:after="20" w:before="100"/>
       </w:pPr>
-      <w:hyperlink w:history="1" r:id="rIdy5dtilwkoyax9qi80tfku">
+      <w:hyperlink w:history="1" r:id="rIdf9ueh7-ckk98zd9dhpiwm">
         <w:r>
           <w:rPr>
             <w:rFonts w:ascii="Calibri" w:cs="Calibri" w:eastAsia="Calibri" w:hAnsi="Calibri"/>
@@ -1016,7 +1016,7 @@
         <w:keepNext/>
         <w:spacing w:after="20" w:before="100"/>
       </w:pPr>
-      <w:hyperlink w:history="1" r:id="rIdwfpdtcgucojp0ntbhtfbl">
+      <w:hyperlink w:history="1" r:id="rIdx4ffxipc8rdobbmwgp3zy">
         <w:r>
           <w:rPr>
             <w:rFonts w:ascii="Calibri" w:cs="Calibri" w:eastAsia="Calibri" w:hAnsi="Calibri"/>
@@ -1065,7 +1065,7 @@
           <w:szCs w:val="20"/>
           <w:u w:val="single"/>
         </w:rPr>
-        <w:t xml:space="preserve">JobVault – Job Application Tracking Platform</w:t>
+        <w:t xml:space="preserve">JobVault – AI-Driven Job Application Platform</w:t>
       </w:r>
     </w:p>
     <w:p>
@@ -1084,7 +1084,7 @@
           <w:sz w:val="20"/>
           <w:szCs w:val="20"/>
         </w:rPr>
-        <w:t xml:space="preserve">Architected and built a self-hosted job-application management platform using .NET 9, Vue 3, MongoDB, and RabbitMQ, deployed via Cloudflare Tunnel</w:t>
+        <w:t xml:space="preserve">Architected a self-hosted platform (.NET 9, Vue 3, MongoDB) where a Claude-powered agent evaluates job postings and selects real experience from a curated bullet library to generate tailored CVs and cover letters, removing manual tailoring and constraining generation against hallucinated experience</w:t>
       </w:r>
     </w:p>
     <w:p>
@@ -1103,7 +1103,26 @@
           <w:sz w:val="20"/>
           <w:szCs w:val="20"/>
         </w:rPr>
-        <w:t xml:space="preserve">Designed an event-driven backend using RabbitMQ and GitHub webhook ingestion to automatically capture, store, and version application documents committed to a private repository</w:t>
+        <w:t xml:space="preserve">Built an event-driven pipeline (RabbitMQ, Worker service) that generates DOCX/PDF documents and commits them atomically to a GitHub-based document vault via the Git Trees API, with dead-letter retry handling</w:t>
+      </w:r>
+    </w:p>
+    <w:p>
+      <w:pPr>
+        <w:pStyle w:val="ListParagraph"/>
+        <w:numPr>
+          <w:ilvl w:val="0"/>
+          <w:numId w:val="2"/>
+        </w:numPr>
+        <w:spacing w:after="20" w:before="20"/>
+      </w:pPr>
+      <w:r>
+        <w:rPr>
+          <w:rFonts w:ascii="Calibri" w:cs="Calibri" w:eastAsia="Calibri" w:hAnsi="Calibri"/>
+          <w:color w:val="333333"/>
+          <w:sz w:val="20"/>
+          <w:szCs w:val="20"/>
+        </w:rPr>
+        <w:t xml:space="preserve">Deployed via a full GitHub Actions CI/CD pipeline and Cloudflare Tunnel, achieving 11ms average API response time at 0% error rate under load testing (k6)</w:t>
       </w:r>
     </w:p>
     <w:p>

</xml_diff>

<commit_message>
Add GitHub link and refine load-testing detail for JobVault project
Link the JobVault project title to its repo and update the deployment
bullet with the specific Postman load-test parameters (20 VUs, 2,000
requests) instead of the generic k6 mention.
</commit_message>
<xml_diff>
--- a/templates/cv_template.docx
+++ b/templates/cv_template.docx
@@ -54,7 +54,7 @@
         <w:spacing w:after="0" w:before="0"/>
         <w:jc w:val="center"/>
       </w:pPr>
-      <w:hyperlink w:history="1" r:id="rId0n-hny-ng-rtcjdwinffh">
+      <w:hyperlink w:history="1" r:id="rIdbva6sqvtjvfplc_fcl1py">
         <w:r>
           <w:rPr>
             <w:rFonts w:ascii="Calibri" w:cs="Calibri" w:eastAsia="Calibri" w:hAnsi="Calibri"/>
@@ -75,7 +75,7 @@
         </w:rPr>
         <w:t xml:space="preserve">  |  </w:t>
       </w:r>
-      <w:hyperlink w:history="1" r:id="rId2mecg1omohuw3zbn0hi_y">
+      <w:hyperlink w:history="1" r:id="rId2sw63alnawmfail73wd-h">
         <w:r>
           <w:rPr>
             <w:rFonts w:ascii="Calibri" w:cs="Calibri" w:eastAsia="Calibri" w:hAnsi="Calibri"/>
@@ -938,7 +938,7 @@
         <w:keepNext/>
         <w:spacing w:after="20" w:before="100"/>
       </w:pPr>
-      <w:hyperlink w:history="1" r:id="rIdcy8-ijlwl489ylj1pljsd">
+      <w:hyperlink w:history="1" r:id="rIdyhbzi_tqfptf3h650llhi">
         <w:r>
           <w:rPr>
             <w:rFonts w:ascii="Calibri" w:cs="Calibri" w:eastAsia="Calibri" w:hAnsi="Calibri"/>
@@ -977,7 +977,7 @@
         <w:keepNext/>
         <w:spacing w:after="20" w:before="100"/>
       </w:pPr>
-      <w:hyperlink w:history="1" r:id="rIdf9ueh7-ckk98zd9dhpiwm">
+      <w:hyperlink w:history="1" r:id="rIdsdcct6qxmrs1ctgv-woaq">
         <w:r>
           <w:rPr>
             <w:rFonts w:ascii="Calibri" w:cs="Calibri" w:eastAsia="Calibri" w:hAnsi="Calibri"/>
@@ -1016,7 +1016,7 @@
         <w:keepNext/>
         <w:spacing w:after="20" w:before="100"/>
       </w:pPr>
-      <w:hyperlink w:history="1" r:id="rIdx4ffxipc8rdobbmwgp3zy">
+      <w:hyperlink w:history="1" r:id="rIdujvzriunfgstezaxzc24k">
         <w:r>
           <w:rPr>
             <w:rFonts w:ascii="Calibri" w:cs="Calibri" w:eastAsia="Calibri" w:hAnsi="Calibri"/>
@@ -1055,18 +1055,20 @@
         <w:keepNext/>
         <w:spacing w:after="20" w:before="100"/>
       </w:pPr>
-      <w:r>
-        <w:rPr>
-          <w:rFonts w:ascii="Calibri" w:cs="Calibri" w:eastAsia="Calibri" w:hAnsi="Calibri"/>
-          <w:b/>
-          <w:bCs/>
-          <w:color w:val="2E75B6"/>
-          <w:sz w:val="20"/>
-          <w:szCs w:val="20"/>
-          <w:u w:val="single"/>
-        </w:rPr>
-        <w:t xml:space="preserve">JobVault – AI-Driven Job Application Platform</w:t>
-      </w:r>
+      <w:hyperlink w:history="1" r:id="rIdt2zx_ot_kmv9ts7nqdbvl">
+        <w:r>
+          <w:rPr>
+            <w:rFonts w:ascii="Calibri" w:cs="Calibri" w:eastAsia="Calibri" w:hAnsi="Calibri"/>
+            <w:b/>
+            <w:bCs/>
+            <w:color w:val="2E75B6"/>
+            <w:sz w:val="20"/>
+            <w:szCs w:val="20"/>
+            <w:u w:val="single"/>
+          </w:rPr>
+          <w:t xml:space="preserve">JobVault – AI-Driven Job Application Platform</w:t>
+        </w:r>
+      </w:hyperlink>
     </w:p>
     <w:p>
       <w:pPr>
@@ -1122,7 +1124,7 @@
           <w:sz w:val="20"/>
           <w:szCs w:val="20"/>
         </w:rPr>
-        <w:t xml:space="preserve">Deployed via a full GitHub Actions CI/CD pipeline and Cloudflare Tunnel, achieving 11ms average API response time at 0% error rate under load testing (k6)</w:t>
+        <w:t xml:space="preserve">Deployed via a full GitHub Actions CI/CD pipeline and Cloudflare Tunnel, sustaining 11ms average response time at 0% error rate under Postman-based load testing (20 virtual users, 2,000 requests)</w:t>
       </w:r>
     </w:p>
     <w:p>

</xml_diff>

<commit_message>
Add GitHub link and refine load-testing detail for JobVault project (#6)
Link the JobVault project title to its repo and update the deployment
bullet with the specific Postman load-test parameters (20 VUs, 2,000
requests) instead of the generic k6 mention.

Co-authored-by: Claude <noreply@anthropic.com>
</commit_message>
<xml_diff>
--- a/templates/cv_template.docx
+++ b/templates/cv_template.docx
@@ -54,7 +54,7 @@
         <w:spacing w:after="0" w:before="0"/>
         <w:jc w:val="center"/>
       </w:pPr>
-      <w:hyperlink w:history="1" r:id="rId0n-hny-ng-rtcjdwinffh">
+      <w:hyperlink w:history="1" r:id="rIdbva6sqvtjvfplc_fcl1py">
         <w:r>
           <w:rPr>
             <w:rFonts w:ascii="Calibri" w:cs="Calibri" w:eastAsia="Calibri" w:hAnsi="Calibri"/>
@@ -75,7 +75,7 @@
         </w:rPr>
         <w:t xml:space="preserve">  |  </w:t>
       </w:r>
-      <w:hyperlink w:history="1" r:id="rId2mecg1omohuw3zbn0hi_y">
+      <w:hyperlink w:history="1" r:id="rId2sw63alnawmfail73wd-h">
         <w:r>
           <w:rPr>
             <w:rFonts w:ascii="Calibri" w:cs="Calibri" w:eastAsia="Calibri" w:hAnsi="Calibri"/>
@@ -938,7 +938,7 @@
         <w:keepNext/>
         <w:spacing w:after="20" w:before="100"/>
       </w:pPr>
-      <w:hyperlink w:history="1" r:id="rIdcy8-ijlwl489ylj1pljsd">
+      <w:hyperlink w:history="1" r:id="rIdyhbzi_tqfptf3h650llhi">
         <w:r>
           <w:rPr>
             <w:rFonts w:ascii="Calibri" w:cs="Calibri" w:eastAsia="Calibri" w:hAnsi="Calibri"/>
@@ -977,7 +977,7 @@
         <w:keepNext/>
         <w:spacing w:after="20" w:before="100"/>
       </w:pPr>
-      <w:hyperlink w:history="1" r:id="rIdf9ueh7-ckk98zd9dhpiwm">
+      <w:hyperlink w:history="1" r:id="rIdsdcct6qxmrs1ctgv-woaq">
         <w:r>
           <w:rPr>
             <w:rFonts w:ascii="Calibri" w:cs="Calibri" w:eastAsia="Calibri" w:hAnsi="Calibri"/>
@@ -1016,7 +1016,7 @@
         <w:keepNext/>
         <w:spacing w:after="20" w:before="100"/>
       </w:pPr>
-      <w:hyperlink w:history="1" r:id="rIdx4ffxipc8rdobbmwgp3zy">
+      <w:hyperlink w:history="1" r:id="rIdujvzriunfgstezaxzc24k">
         <w:r>
           <w:rPr>
             <w:rFonts w:ascii="Calibri" w:cs="Calibri" w:eastAsia="Calibri" w:hAnsi="Calibri"/>
@@ -1055,18 +1055,20 @@
         <w:keepNext/>
         <w:spacing w:after="20" w:before="100"/>
       </w:pPr>
-      <w:r>
-        <w:rPr>
-          <w:rFonts w:ascii="Calibri" w:cs="Calibri" w:eastAsia="Calibri" w:hAnsi="Calibri"/>
-          <w:b/>
-          <w:bCs/>
-          <w:color w:val="2E75B6"/>
-          <w:sz w:val="20"/>
-          <w:szCs w:val="20"/>
-          <w:u w:val="single"/>
-        </w:rPr>
-        <w:t xml:space="preserve">JobVault – AI-Driven Job Application Platform</w:t>
-      </w:r>
+      <w:hyperlink w:history="1" r:id="rIdt2zx_ot_kmv9ts7nqdbvl">
+        <w:r>
+          <w:rPr>
+            <w:rFonts w:ascii="Calibri" w:cs="Calibri" w:eastAsia="Calibri" w:hAnsi="Calibri"/>
+            <w:b/>
+            <w:bCs/>
+            <w:color w:val="2E75B6"/>
+            <w:sz w:val="20"/>
+            <w:szCs w:val="20"/>
+            <w:u w:val="single"/>
+          </w:rPr>
+          <w:t xml:space="preserve">JobVault – AI-Driven Job Application Platform</w:t>
+        </w:r>
+      </w:hyperlink>
     </w:p>
     <w:p>
       <w:pPr>
@@ -1122,7 +1124,7 @@
           <w:sz w:val="20"/>
           <w:szCs w:val="20"/>
         </w:rPr>
-        <w:t xml:space="preserve">Deployed via a full GitHub Actions CI/CD pipeline and Cloudflare Tunnel, achieving 11ms average API response time at 0% error rate under load testing (k6)</w:t>
+        <w:t xml:space="preserve">Deployed via a full GitHub Actions CI/CD pipeline and Cloudflare Tunnel, sustaining 11ms average response time at 0% error rate under Postman-based load testing (20 virtual users, 2,000 requests)</w:t>
       </w:r>
     </w:p>
     <w:p>

</xml_diff>

<commit_message>
Regenerate cv_template.docx from updated build script
Reflects the AZ-204 -> AI-200 certification text change in scripts/build-cv-template.js.

Co-Authored-By: Claude Sonnet 5 <noreply@anthropic.com>
</commit_message>
<xml_diff>
--- a/templates/cv_template.docx
+++ b/templates/cv_template.docx
@@ -54,7 +54,7 @@
         <w:spacing w:after="0" w:before="0"/>
         <w:jc w:val="center"/>
       </w:pPr>
-      <w:hyperlink w:history="1" r:id="rIdbva6sqvtjvfplc_fcl1py">
+      <w:hyperlink w:history="1" r:id="rIdmld2fx882elffmoevyv3c">
         <w:r>
           <w:rPr>
             <w:rFonts w:ascii="Calibri" w:cs="Calibri" w:eastAsia="Calibri" w:hAnsi="Calibri"/>
@@ -75,7 +75,7 @@
         </w:rPr>
         <w:t xml:space="preserve">  |  </w:t>
       </w:r>
-      <w:hyperlink w:history="1" r:id="rId2sw63alnawmfail73wd-h">
+      <w:hyperlink w:history="1" r:id="rIdm3ghdjkw1wzryuhxaanfb">
         <w:r>
           <w:rPr>
             <w:rFonts w:ascii="Calibri" w:cs="Calibri" w:eastAsia="Calibri" w:hAnsi="Calibri"/>
@@ -938,7 +938,7 @@
         <w:keepNext/>
         <w:spacing w:after="20" w:before="100"/>
       </w:pPr>
-      <w:hyperlink w:history="1" r:id="rIdyhbzi_tqfptf3h650llhi">
+      <w:hyperlink w:history="1" r:id="rIdylrhquxjnkyjismqgr_ot">
         <w:r>
           <w:rPr>
             <w:rFonts w:ascii="Calibri" w:cs="Calibri" w:eastAsia="Calibri" w:hAnsi="Calibri"/>
@@ -977,7 +977,7 @@
         <w:keepNext/>
         <w:spacing w:after="20" w:before="100"/>
       </w:pPr>
-      <w:hyperlink w:history="1" r:id="rIdsdcct6qxmrs1ctgv-woaq">
+      <w:hyperlink w:history="1" r:id="rIdxc9xcmauywd7w9oa7mtzl">
         <w:r>
           <w:rPr>
             <w:rFonts w:ascii="Calibri" w:cs="Calibri" w:eastAsia="Calibri" w:hAnsi="Calibri"/>
@@ -1016,7 +1016,7 @@
         <w:keepNext/>
         <w:spacing w:after="20" w:before="100"/>
       </w:pPr>
-      <w:hyperlink w:history="1" r:id="rIdujvzriunfgstezaxzc24k">
+      <w:hyperlink w:history="1" r:id="rIdo3ymyhqxnim0udpluaqr3">
         <w:r>
           <w:rPr>
             <w:rFonts w:ascii="Calibri" w:cs="Calibri" w:eastAsia="Calibri" w:hAnsi="Calibri"/>
@@ -1055,7 +1055,7 @@
         <w:keepNext/>
         <w:spacing w:after="20" w:before="100"/>
       </w:pPr>
-      <w:hyperlink w:history="1" r:id="rIdt2zx_ot_kmv9ts7nqdbvl">
+      <w:hyperlink w:history="1" r:id="rIdfniyqytyohkztvkf_jkca">
         <w:r>
           <w:rPr>
             <w:rFonts w:ascii="Calibri" w:cs="Calibri" w:eastAsia="Calibri" w:hAnsi="Calibri"/>
@@ -1177,7 +1177,7 @@
           <w:sz w:val="20"/>
           <w:szCs w:val="20"/>
         </w:rPr>
-        <w:t xml:space="preserve">AZ-204: Developing Solutions for Microsoft Azure – In Progress</w:t>
+        <w:t xml:space="preserve">AI-200: Azure AI Cloud Developer Associate – In Progress</w:t>
       </w:r>
     </w:p>
     <w:p>

</xml_diff>

<commit_message>
Add Independent Software Engineer role to CV template
Adds a new fixed Work Experience entry (Independent Software Engineer /
Product Development, 01/2026 - Present, Self-Employed - Remote) above
Calvergy in cv_template.docx, describing the JobVault platform build.
Bullets are static (not per-JD tailored), so no docxtemplater loop tag
or payload/generateCv.ts changes were needed.

Removes the now-duplicate JobVault entry from Notable Projects since
it's promoted to a full role. Updates README's fixed-content section
from 4 to 5 roles.

Co-Authored-By: Claude Sonnet 5 <noreply@anthropic.com>
</commit_message>
<xml_diff>
--- a/templates/cv_template.docx
+++ b/templates/cv_template.docx
@@ -54,7 +54,7 @@
         <w:spacing w:after="0" w:before="0"/>
         <w:jc w:val="center"/>
       </w:pPr>
-      <w:hyperlink w:history="1" r:id="rIdmld2fx882elffmoevyv3c">
+      <w:hyperlink w:history="1" r:id="rIdww_p6ys0d3adpbrj4wg3s">
         <w:r>
           <w:rPr>
             <w:rFonts w:ascii="Calibri" w:cs="Calibri" w:eastAsia="Calibri" w:hAnsi="Calibri"/>
@@ -75,7 +75,7 @@
         </w:rPr>
         <w:t xml:space="preserve">  |  </w:t>
       </w:r>
-      <w:hyperlink w:history="1" r:id="rIdm3ghdjkw1wzryuhxaanfb">
+      <w:hyperlink w:history="1" r:id="rIdekzwmxd684ojbjmzrby4i">
         <w:r>
           <w:rPr>
             <w:rFonts w:ascii="Calibri" w:cs="Calibri" w:eastAsia="Calibri" w:hAnsi="Calibri"/>
@@ -297,6 +297,136 @@
           <w:sz w:val="20"/>
           <w:szCs w:val="20"/>
         </w:rPr>
+        <w:t xml:space="preserve">Independent Software Engineer / Product Development</w:t>
+      </w:r>
+      <w:r>
+        <w:t xml:space="preserve">	</w:t>
+      </w:r>
+      <w:r>
+        <w:rPr>
+          <w:rFonts w:ascii="Calibri" w:cs="Calibri" w:eastAsia="Calibri" w:hAnsi="Calibri"/>
+          <w:b/>
+          <w:bCs/>
+          <w:color w:val="000000"/>
+          <w:sz w:val="20"/>
+          <w:szCs w:val="20"/>
+        </w:rPr>
+        <w:t xml:space="preserve">01/2026 – Present</w:t>
+      </w:r>
+    </w:p>
+    <w:p>
+      <w:pPr>
+        <w:keepNext/>
+        <w:spacing w:after="60" w:before="0"/>
+      </w:pPr>
+      <w:r>
+        <w:rPr>
+          <w:rFonts w:ascii="Calibri" w:cs="Calibri" w:eastAsia="Calibri" w:hAnsi="Calibri"/>
+          <w:b/>
+          <w:bCs/>
+          <w:color w:val="000000"/>
+          <w:sz w:val="20"/>
+          <w:szCs w:val="20"/>
+        </w:rPr>
+        <w:t xml:space="preserve">Self-Employed</w:t>
+      </w:r>
+      <w:r>
+        <w:rPr>
+          <w:rFonts w:ascii="Calibri" w:cs="Calibri" w:eastAsia="Calibri" w:hAnsi="Calibri"/>
+          <w:color w:val="000000"/>
+          <w:sz w:val="20"/>
+          <w:szCs w:val="20"/>
+        </w:rPr>
+        <w:t xml:space="preserve">  –  Remote</w:t>
+      </w:r>
+    </w:p>
+    <w:p>
+      <w:pPr>
+        <w:pStyle w:val="ListParagraph"/>
+        <w:numPr>
+          <w:ilvl w:val="0"/>
+          <w:numId w:val="2"/>
+        </w:numPr>
+        <w:spacing w:after="20" w:before="20"/>
+      </w:pPr>
+      <w:r>
+        <w:rPr>
+          <w:rFonts w:ascii="Calibri" w:cs="Calibri" w:eastAsia="Calibri" w:hAnsi="Calibri"/>
+          <w:color w:val="333333"/>
+          <w:sz w:val="20"/>
+          <w:szCs w:val="20"/>
+        </w:rPr>
+        <w:t xml:space="preserve">Architected and built JobVault, a self-hosted AI-driven job application platform (.NET 9, Vue 3, MongoDB) where a Claude-powered agent evaluates job postings and generates tailored CVs/cover letters from a curated experience library</w:t>
+      </w:r>
+    </w:p>
+    <w:p>
+      <w:pPr>
+        <w:pStyle w:val="ListParagraph"/>
+        <w:numPr>
+          <w:ilvl w:val="0"/>
+          <w:numId w:val="2"/>
+        </w:numPr>
+        <w:spacing w:after="20" w:before="20"/>
+      </w:pPr>
+      <w:r>
+        <w:rPr>
+          <w:rFonts w:ascii="Calibri" w:cs="Calibri" w:eastAsia="Calibri" w:hAnsi="Calibri"/>
+          <w:color w:val="333333"/>
+          <w:sz w:val="20"/>
+          <w:szCs w:val="20"/>
+        </w:rPr>
+        <w:t xml:space="preserve">Built an event-driven pipeline (RabbitMQ, Worker service) generating DOCX/PDF documents and committing them atomically to a GitHub-based document vault via the Git Trees API, with dead-letter retry handling</w:t>
+      </w:r>
+    </w:p>
+    <w:p>
+      <w:pPr>
+        <w:pStyle w:val="ListParagraph"/>
+        <w:numPr>
+          <w:ilvl w:val="0"/>
+          <w:numId w:val="2"/>
+        </w:numPr>
+        <w:spacing w:after="20" w:before="20"/>
+      </w:pPr>
+      <w:r>
+        <w:rPr>
+          <w:rFonts w:ascii="Calibri" w:cs="Calibri" w:eastAsia="Calibri" w:hAnsi="Calibri"/>
+          <w:color w:val="333333"/>
+          <w:sz w:val="20"/>
+          <w:szCs w:val="20"/>
+        </w:rPr>
+        <w:t xml:space="preserve">Deployed via GitHub Actions CI/CD and Cloudflare Tunnel, sustaining 11ms average response time at 0% error rate under load testing</w:t>
+      </w:r>
+    </w:p>
+    <w:p>
+      <w:pPr>
+        <w:spacing w:after="0" w:before="80"/>
+      </w:pPr>
+      <w:r>
+        <w:rPr>
+          <w:rFonts w:ascii="Calibri" w:cs="Calibri" w:eastAsia="Calibri" w:hAnsi="Calibri"/>
+          <w:sz w:val="20"/>
+          <w:szCs w:val="20"/>
+        </w:rPr>
+        <w:t xml:space="preserve"/>
+      </w:r>
+    </w:p>
+    <w:p>
+      <w:pPr>
+        <w:keepNext/>
+        <w:tabs>
+          <w:tab w:val="right" w:pos="10772"/>
+        </w:tabs>
+        <w:spacing w:after="0" w:before="140"/>
+      </w:pPr>
+      <w:r>
+        <w:rPr>
+          <w:rFonts w:ascii="Calibri" w:cs="Calibri" w:eastAsia="Calibri" w:hAnsi="Calibri"/>
+          <w:b/>
+          <w:bCs/>
+          <w:color w:val="2E75B6"/>
+          <w:sz w:val="20"/>
+          <w:szCs w:val="20"/>
+        </w:rPr>
         <w:t xml:space="preserve">Software Engineer</w:t>
       </w:r>
       <w:r>
@@ -938,7 +1068,7 @@
         <w:keepNext/>
         <w:spacing w:after="20" w:before="100"/>
       </w:pPr>
-      <w:hyperlink w:history="1" r:id="rIdylrhquxjnkyjismqgr_ot">
+      <w:hyperlink w:history="1" r:id="rId21ym5acj-sso776orizxp">
         <w:r>
           <w:rPr>
             <w:rFonts w:ascii="Calibri" w:cs="Calibri" w:eastAsia="Calibri" w:hAnsi="Calibri"/>
@@ -977,7 +1107,7 @@
         <w:keepNext/>
         <w:spacing w:after="20" w:before="100"/>
       </w:pPr>
-      <w:hyperlink w:history="1" r:id="rIdxc9xcmauywd7w9oa7mtzl">
+      <w:hyperlink w:history="1" r:id="rIdgwo5nfxp2nzqxw9rgkiyt">
         <w:r>
           <w:rPr>
             <w:rFonts w:ascii="Calibri" w:cs="Calibri" w:eastAsia="Calibri" w:hAnsi="Calibri"/>
@@ -1016,7 +1146,7 @@
         <w:keepNext/>
         <w:spacing w:after="20" w:before="100"/>
       </w:pPr>
-      <w:hyperlink w:history="1" r:id="rIdo3ymyhqxnim0udpluaqr3">
+      <w:hyperlink w:history="1" r:id="rIdbh5hwyeo7qfq-mztv_nlv">
         <w:r>
           <w:rPr>
             <w:rFonts w:ascii="Calibri" w:cs="Calibri" w:eastAsia="Calibri" w:hAnsi="Calibri"/>
@@ -1048,83 +1178,6 @@
           <w:szCs w:val="20"/>
         </w:rPr>
         <w:t xml:space="preserve">Developed with React.js + .NET 8, serving 3M+ internal shippers with JWT-secured, role-based access control</w:t>
-      </w:r>
-    </w:p>
-    <w:p>
-      <w:pPr>
-        <w:keepNext/>
-        <w:spacing w:after="20" w:before="100"/>
-      </w:pPr>
-      <w:hyperlink w:history="1" r:id="rIdfniyqytyohkztvkf_jkca">
-        <w:r>
-          <w:rPr>
-            <w:rFonts w:ascii="Calibri" w:cs="Calibri" w:eastAsia="Calibri" w:hAnsi="Calibri"/>
-            <w:b/>
-            <w:bCs/>
-            <w:color w:val="2E75B6"/>
-            <w:sz w:val="20"/>
-            <w:szCs w:val="20"/>
-            <w:u w:val="single"/>
-          </w:rPr>
-          <w:t xml:space="preserve">JobVault – AI-Driven Job Application Platform</w:t>
-        </w:r>
-      </w:hyperlink>
-    </w:p>
-    <w:p>
-      <w:pPr>
-        <w:pStyle w:val="ListParagraph"/>
-        <w:numPr>
-          <w:ilvl w:val="0"/>
-          <w:numId w:val="2"/>
-        </w:numPr>
-        <w:spacing w:after="20" w:before="20"/>
-      </w:pPr>
-      <w:r>
-        <w:rPr>
-          <w:rFonts w:ascii="Calibri" w:cs="Calibri" w:eastAsia="Calibri" w:hAnsi="Calibri"/>
-          <w:color w:val="333333"/>
-          <w:sz w:val="20"/>
-          <w:szCs w:val="20"/>
-        </w:rPr>
-        <w:t xml:space="preserve">Architected a self-hosted platform (.NET 9, Vue 3, MongoDB) where a Claude-powered agent evaluates job postings and selects real experience from a curated bullet library to generate tailored CVs and cover letters, removing manual tailoring and constraining generation against hallucinated experience</w:t>
-      </w:r>
-    </w:p>
-    <w:p>
-      <w:pPr>
-        <w:pStyle w:val="ListParagraph"/>
-        <w:numPr>
-          <w:ilvl w:val="0"/>
-          <w:numId w:val="2"/>
-        </w:numPr>
-        <w:spacing w:after="20" w:before="20"/>
-      </w:pPr>
-      <w:r>
-        <w:rPr>
-          <w:rFonts w:ascii="Calibri" w:cs="Calibri" w:eastAsia="Calibri" w:hAnsi="Calibri"/>
-          <w:color w:val="333333"/>
-          <w:sz w:val="20"/>
-          <w:szCs w:val="20"/>
-        </w:rPr>
-        <w:t xml:space="preserve">Built an event-driven pipeline (RabbitMQ, Worker service) that generates DOCX/PDF documents and commits them atomically to a GitHub-based document vault via the Git Trees API, with dead-letter retry handling</w:t>
-      </w:r>
-    </w:p>
-    <w:p>
-      <w:pPr>
-        <w:pStyle w:val="ListParagraph"/>
-        <w:numPr>
-          <w:ilvl w:val="0"/>
-          <w:numId w:val="2"/>
-        </w:numPr>
-        <w:spacing w:after="20" w:before="20"/>
-      </w:pPr>
-      <w:r>
-        <w:rPr>
-          <w:rFonts w:ascii="Calibri" w:cs="Calibri" w:eastAsia="Calibri" w:hAnsi="Calibri"/>
-          <w:color w:val="333333"/>
-          <w:sz w:val="20"/>
-          <w:szCs w:val="20"/>
-        </w:rPr>
-        <w:t xml:space="preserve">Deployed via a full GitHub Actions CI/CD pipeline and Cloudflare Tunnel, sustaining 11ms average response time at 0% error rate under Postman-based load testing (20 virtual users, 2,000 requests)</w:t>
       </w:r>
     </w:p>
     <w:p>

</xml_diff>

<commit_message>
Add Independent Software Engineer role to CV template (#8)
Adds a new fixed Work Experience entry (Independent Software Engineer /
Product Development, 01/2026 - Present, Self-Employed - Remote) above
Calvergy in cv_template.docx, describing the JobVault platform build.
Bullets are static (not per-JD tailored), so no docxtemplater loop tag
or payload/generateCv.ts changes were needed.

Removes the now-duplicate JobVault entry from Notable Projects since
it's promoted to a full role. Updates README's fixed-content section
from 4 to 5 roles.

Co-authored-by: Claude Sonnet 5 <noreply@anthropic.com>
</commit_message>
<xml_diff>
--- a/templates/cv_template.docx
+++ b/templates/cv_template.docx
@@ -54,7 +54,7 @@
         <w:spacing w:after="0" w:before="0"/>
         <w:jc w:val="center"/>
       </w:pPr>
-      <w:hyperlink w:history="1" r:id="rIdmld2fx882elffmoevyv3c">
+      <w:hyperlink w:history="1" r:id="rIdww_p6ys0d3adpbrj4wg3s">
         <w:r>
           <w:rPr>
             <w:rFonts w:ascii="Calibri" w:cs="Calibri" w:eastAsia="Calibri" w:hAnsi="Calibri"/>
@@ -75,7 +75,7 @@
         </w:rPr>
         <w:t xml:space="preserve">  |  </w:t>
       </w:r>
-      <w:hyperlink w:history="1" r:id="rIdm3ghdjkw1wzryuhxaanfb">
+      <w:hyperlink w:history="1" r:id="rIdekzwmxd684ojbjmzrby4i">
         <w:r>
           <w:rPr>
             <w:rFonts w:ascii="Calibri" w:cs="Calibri" w:eastAsia="Calibri" w:hAnsi="Calibri"/>
@@ -297,6 +297,136 @@
           <w:sz w:val="20"/>
           <w:szCs w:val="20"/>
         </w:rPr>
+        <w:t xml:space="preserve">Independent Software Engineer / Product Development</w:t>
+      </w:r>
+      <w:r>
+        <w:t xml:space="preserve">	</w:t>
+      </w:r>
+      <w:r>
+        <w:rPr>
+          <w:rFonts w:ascii="Calibri" w:cs="Calibri" w:eastAsia="Calibri" w:hAnsi="Calibri"/>
+          <w:b/>
+          <w:bCs/>
+          <w:color w:val="000000"/>
+          <w:sz w:val="20"/>
+          <w:szCs w:val="20"/>
+        </w:rPr>
+        <w:t xml:space="preserve">01/2026 – Present</w:t>
+      </w:r>
+    </w:p>
+    <w:p>
+      <w:pPr>
+        <w:keepNext/>
+        <w:spacing w:after="60" w:before="0"/>
+      </w:pPr>
+      <w:r>
+        <w:rPr>
+          <w:rFonts w:ascii="Calibri" w:cs="Calibri" w:eastAsia="Calibri" w:hAnsi="Calibri"/>
+          <w:b/>
+          <w:bCs/>
+          <w:color w:val="000000"/>
+          <w:sz w:val="20"/>
+          <w:szCs w:val="20"/>
+        </w:rPr>
+        <w:t xml:space="preserve">Self-Employed</w:t>
+      </w:r>
+      <w:r>
+        <w:rPr>
+          <w:rFonts w:ascii="Calibri" w:cs="Calibri" w:eastAsia="Calibri" w:hAnsi="Calibri"/>
+          <w:color w:val="000000"/>
+          <w:sz w:val="20"/>
+          <w:szCs w:val="20"/>
+        </w:rPr>
+        <w:t xml:space="preserve">  –  Remote</w:t>
+      </w:r>
+    </w:p>
+    <w:p>
+      <w:pPr>
+        <w:pStyle w:val="ListParagraph"/>
+        <w:numPr>
+          <w:ilvl w:val="0"/>
+          <w:numId w:val="2"/>
+        </w:numPr>
+        <w:spacing w:after="20" w:before="20"/>
+      </w:pPr>
+      <w:r>
+        <w:rPr>
+          <w:rFonts w:ascii="Calibri" w:cs="Calibri" w:eastAsia="Calibri" w:hAnsi="Calibri"/>
+          <w:color w:val="333333"/>
+          <w:sz w:val="20"/>
+          <w:szCs w:val="20"/>
+        </w:rPr>
+        <w:t xml:space="preserve">Architected and built JobVault, a self-hosted AI-driven job application platform (.NET 9, Vue 3, MongoDB) where a Claude-powered agent evaluates job postings and generates tailored CVs/cover letters from a curated experience library</w:t>
+      </w:r>
+    </w:p>
+    <w:p>
+      <w:pPr>
+        <w:pStyle w:val="ListParagraph"/>
+        <w:numPr>
+          <w:ilvl w:val="0"/>
+          <w:numId w:val="2"/>
+        </w:numPr>
+        <w:spacing w:after="20" w:before="20"/>
+      </w:pPr>
+      <w:r>
+        <w:rPr>
+          <w:rFonts w:ascii="Calibri" w:cs="Calibri" w:eastAsia="Calibri" w:hAnsi="Calibri"/>
+          <w:color w:val="333333"/>
+          <w:sz w:val="20"/>
+          <w:szCs w:val="20"/>
+        </w:rPr>
+        <w:t xml:space="preserve">Built an event-driven pipeline (RabbitMQ, Worker service) generating DOCX/PDF documents and committing them atomically to a GitHub-based document vault via the Git Trees API, with dead-letter retry handling</w:t>
+      </w:r>
+    </w:p>
+    <w:p>
+      <w:pPr>
+        <w:pStyle w:val="ListParagraph"/>
+        <w:numPr>
+          <w:ilvl w:val="0"/>
+          <w:numId w:val="2"/>
+        </w:numPr>
+        <w:spacing w:after="20" w:before="20"/>
+      </w:pPr>
+      <w:r>
+        <w:rPr>
+          <w:rFonts w:ascii="Calibri" w:cs="Calibri" w:eastAsia="Calibri" w:hAnsi="Calibri"/>
+          <w:color w:val="333333"/>
+          <w:sz w:val="20"/>
+          <w:szCs w:val="20"/>
+        </w:rPr>
+        <w:t xml:space="preserve">Deployed via GitHub Actions CI/CD and Cloudflare Tunnel, sustaining 11ms average response time at 0% error rate under load testing</w:t>
+      </w:r>
+    </w:p>
+    <w:p>
+      <w:pPr>
+        <w:spacing w:after="0" w:before="80"/>
+      </w:pPr>
+      <w:r>
+        <w:rPr>
+          <w:rFonts w:ascii="Calibri" w:cs="Calibri" w:eastAsia="Calibri" w:hAnsi="Calibri"/>
+          <w:sz w:val="20"/>
+          <w:szCs w:val="20"/>
+        </w:rPr>
+        <w:t xml:space="preserve"/>
+      </w:r>
+    </w:p>
+    <w:p>
+      <w:pPr>
+        <w:keepNext/>
+        <w:tabs>
+          <w:tab w:val="right" w:pos="10772"/>
+        </w:tabs>
+        <w:spacing w:after="0" w:before="140"/>
+      </w:pPr>
+      <w:r>
+        <w:rPr>
+          <w:rFonts w:ascii="Calibri" w:cs="Calibri" w:eastAsia="Calibri" w:hAnsi="Calibri"/>
+          <w:b/>
+          <w:bCs/>
+          <w:color w:val="2E75B6"/>
+          <w:sz w:val="20"/>
+          <w:szCs w:val="20"/>
+        </w:rPr>
         <w:t xml:space="preserve">Software Engineer</w:t>
       </w:r>
       <w:r>
@@ -938,7 +1068,7 @@
         <w:keepNext/>
         <w:spacing w:after="20" w:before="100"/>
       </w:pPr>
-      <w:hyperlink w:history="1" r:id="rIdylrhquxjnkyjismqgr_ot">
+      <w:hyperlink w:history="1" r:id="rId21ym5acj-sso776orizxp">
         <w:r>
           <w:rPr>
             <w:rFonts w:ascii="Calibri" w:cs="Calibri" w:eastAsia="Calibri" w:hAnsi="Calibri"/>
@@ -977,7 +1107,7 @@
         <w:keepNext/>
         <w:spacing w:after="20" w:before="100"/>
       </w:pPr>
-      <w:hyperlink w:history="1" r:id="rIdxc9xcmauywd7w9oa7mtzl">
+      <w:hyperlink w:history="1" r:id="rIdgwo5nfxp2nzqxw9rgkiyt">
         <w:r>
           <w:rPr>
             <w:rFonts w:ascii="Calibri" w:cs="Calibri" w:eastAsia="Calibri" w:hAnsi="Calibri"/>
@@ -1016,7 +1146,7 @@
         <w:keepNext/>
         <w:spacing w:after="20" w:before="100"/>
       </w:pPr>
-      <w:hyperlink w:history="1" r:id="rIdo3ymyhqxnim0udpluaqr3">
+      <w:hyperlink w:history="1" r:id="rIdbh5hwyeo7qfq-mztv_nlv">
         <w:r>
           <w:rPr>
             <w:rFonts w:ascii="Calibri" w:cs="Calibri" w:eastAsia="Calibri" w:hAnsi="Calibri"/>
@@ -1048,83 +1178,6 @@
           <w:szCs w:val="20"/>
         </w:rPr>
         <w:t xml:space="preserve">Developed with React.js + .NET 8, serving 3M+ internal shippers with JWT-secured, role-based access control</w:t>
-      </w:r>
-    </w:p>
-    <w:p>
-      <w:pPr>
-        <w:keepNext/>
-        <w:spacing w:after="20" w:before="100"/>
-      </w:pPr>
-      <w:hyperlink w:history="1" r:id="rIdfniyqytyohkztvkf_jkca">
-        <w:r>
-          <w:rPr>
-            <w:rFonts w:ascii="Calibri" w:cs="Calibri" w:eastAsia="Calibri" w:hAnsi="Calibri"/>
-            <w:b/>
-            <w:bCs/>
-            <w:color w:val="2E75B6"/>
-            <w:sz w:val="20"/>
-            <w:szCs w:val="20"/>
-            <w:u w:val="single"/>
-          </w:rPr>
-          <w:t xml:space="preserve">JobVault – AI-Driven Job Application Platform</w:t>
-        </w:r>
-      </w:hyperlink>
-    </w:p>
-    <w:p>
-      <w:pPr>
-        <w:pStyle w:val="ListParagraph"/>
-        <w:numPr>
-          <w:ilvl w:val="0"/>
-          <w:numId w:val="2"/>
-        </w:numPr>
-        <w:spacing w:after="20" w:before="20"/>
-      </w:pPr>
-      <w:r>
-        <w:rPr>
-          <w:rFonts w:ascii="Calibri" w:cs="Calibri" w:eastAsia="Calibri" w:hAnsi="Calibri"/>
-          <w:color w:val="333333"/>
-          <w:sz w:val="20"/>
-          <w:szCs w:val="20"/>
-        </w:rPr>
-        <w:t xml:space="preserve">Architected a self-hosted platform (.NET 9, Vue 3, MongoDB) where a Claude-powered agent evaluates job postings and selects real experience from a curated bullet library to generate tailored CVs and cover letters, removing manual tailoring and constraining generation against hallucinated experience</w:t>
-      </w:r>
-    </w:p>
-    <w:p>
-      <w:pPr>
-        <w:pStyle w:val="ListParagraph"/>
-        <w:numPr>
-          <w:ilvl w:val="0"/>
-          <w:numId w:val="2"/>
-        </w:numPr>
-        <w:spacing w:after="20" w:before="20"/>
-      </w:pPr>
-      <w:r>
-        <w:rPr>
-          <w:rFonts w:ascii="Calibri" w:cs="Calibri" w:eastAsia="Calibri" w:hAnsi="Calibri"/>
-          <w:color w:val="333333"/>
-          <w:sz w:val="20"/>
-          <w:szCs w:val="20"/>
-        </w:rPr>
-        <w:t xml:space="preserve">Built an event-driven pipeline (RabbitMQ, Worker service) that generates DOCX/PDF documents and commits them atomically to a GitHub-based document vault via the Git Trees API, with dead-letter retry handling</w:t>
-      </w:r>
-    </w:p>
-    <w:p>
-      <w:pPr>
-        <w:pStyle w:val="ListParagraph"/>
-        <w:numPr>
-          <w:ilvl w:val="0"/>
-          <w:numId w:val="2"/>
-        </w:numPr>
-        <w:spacing w:after="20" w:before="20"/>
-      </w:pPr>
-      <w:r>
-        <w:rPr>
-          <w:rFonts w:ascii="Calibri" w:cs="Calibri" w:eastAsia="Calibri" w:hAnsi="Calibri"/>
-          <w:color w:val="333333"/>
-          <w:sz w:val="20"/>
-          <w:szCs w:val="20"/>
-        </w:rPr>
-        <w:t xml:space="preserve">Deployed via a full GitHub Actions CI/CD pipeline and Cloudflare Tunnel, sustaining 11ms average response time at 0% error rate under Postman-based load testing (20 virtual users, 2,000 requests)</w:t>
       </w:r>
     </w:p>
     <w:p>

</xml_diff>